<commit_message>
Add isolated C/C4/B measurements and prebuilt publication proof
</commit_message>
<xml_diff>
--- a/doc/WASM/CCL_WebAssembly_Stage0_Desk_Decisions_v1_8.docx
+++ b/doc/WASM/CCL_WebAssembly_Stage0_Desk_Decisions_v1_8.docx
@@ -995,7 +995,20 @@
       </w:hyperlink>
       <w:r>
         <w:rPr/>
-        <w:t xml:space="preserve">; they do not select D3.</w:t>
+        <w:t xml:space="preserve">; they do not select D3. The isolated </w:t>
+      </w:r>
+      <w:hyperlink r:id="rId5">
+        <w:r>
+          <w:rPr>
+            <w:color w:val="175C91"/>
+            <w:u w:val="single"/>
+          </w:rPr>
+          <w:t xml:space="preserve">measurement derivative</w:t>
+        </w:r>
+      </w:hyperlink>
+      <w:r>
+        <w:rPr/>
+        <w:t xml:space="preserve"> now supplies exploratory baseline-tier timings across three packaging choices and a new unreviewed S0-LL21-a execution; representative selection evidence remains open.</w:t>
       </w:r>
     </w:p>
     <w:p>
@@ -1450,7 +1463,7 @@
         <w:rPr/>
         <w:t xml:space="preserve">The integrated fixture exposed two lifetime defects (original failures r3 and r6). Claude’s external audit then exposed an exceptional return that left an idle Worker RUNNING (original failure r9). These findings amend protocol v1; the </w:t>
       </w:r>
-      <w:hyperlink r:id="rId5">
+      <w:hyperlink r:id="rId6">
         <w:r>
           <w:rPr>
             <w:color w:val="175C91"/>
@@ -1463,7 +1476,7 @@
         <w:rPr/>
         <w:t xml:space="preserve"> retains the originals and the </w:t>
       </w:r>
-      <w:hyperlink r:id="rId6">
+      <w:hyperlink r:id="rId7">
         <w:r>
           <w:rPr>
             <w:color w:val="175C91"/>
@@ -2073,7 +2086,7 @@
         <w:rPr/>
         <w:t xml:space="preserve">Use S&lt;stage&gt;-LL&lt;nn&gt;-&lt;letter&gt; with an evidence kind and pinned test revision. The JSON inventory lists mandatory IDs, profile/candidate variants, assertions and prerequisites for each experiment phase. The </w:t>
       </w:r>
-      <w:hyperlink r:id="rId7">
+      <w:hyperlink r:id="rId8">
         <w:r>
           <w:rPr>
             <w:color w:val="175C91"/>
@@ -2656,7 +2669,7 @@
         <w:rPr/>
         <w:t xml:space="preserve">[1] x8632 architecture data and execution layouts Tag constants, widths, canonical NIL/T, cons ordering and native execution-layout exceptions. </w:t>
       </w:r>
-      <w:hyperlink r:id="rId8">
+      <w:hyperlink r:id="rId9">
         <w:r>
           <w:rPr>
             <w:color w:val="175C91"/>
@@ -2671,7 +2684,7 @@
         <w:rPr/>
         <w:t xml:space="preserve">[2] C cons layout and accessors CDR then CAR in struct cons; untagged field access. Constructor order is a separate Lisp contract. </w:t>
       </w:r>
-      <w:hyperlink r:id="rId9">
+      <w:hyperlink r:id="rId10">
         <w:r>
           <w:rPr>
             <w:color w:val="175C91"/>
@@ -2684,7 +2697,7 @@
         <w:rPr/>
         <w:t xml:space="preserve"> · </w:t>
       </w:r>
-      <w:hyperlink r:id="rId10">
+      <w:hyperlink r:id="rId11">
         <w:r>
           <w:rPr>
             <w:color w:val="175C91"/>
@@ -2699,7 +2712,7 @@
         <w:rPr/>
         <w:t xml:space="preserve">[3] 32-bit cross-loader and ARM comparison Cross-loading precedent and alternative fulltags; no adoption of native architecture conditionals by implication. </w:t>
       </w:r>
-      <w:hyperlink r:id="rId11">
+      <w:hyperlink r:id="rId12">
         <w:r>
           <w:rPr>
             <w:color w:val="175C91"/>
@@ -2712,7 +2725,7 @@
         <w:rPr/>
         <w:t xml:space="preserve"> · </w:t>
       </w:r>
-      <w:hyperlink r:id="rId12">
+      <w:hyperlink r:id="rId13">
         <w:r>
           <w:rPr>
             <w:color w:val="175C91"/>
@@ -2727,7 +2740,7 @@
         <w:rPr/>
         <w:t xml:space="preserve">[4] WebAssembly core: memory instructions Address arithmetic and nonnegative memarg offsets. Engine optimization costs are not specified. </w:t>
       </w:r>
-      <w:hyperlink r:id="rId13">
+      <w:hyperlink r:id="rId14">
         <w:r>
           <w:rPr>
             <w:color w:val="175C91"/>
@@ -2742,305 +2755,305 @@
         <w:rPr/>
         <w:t xml:space="preserve">[5] WebAssembly memory limits encoding The admitted wasm32 explicit-maximum unshared/shared encodings; exact transforms require validation. </w:t>
       </w:r>
+      <w:hyperlink r:id="rId15">
+        <w:r>
+          <w:rPr>
+            <w:color w:val="175C91"/>
+            <w:u w:val="single"/>
+          </w:rPr>
+          <w:t xml:space="preserve">Threads: limits and memory types</w:t>
+        </w:r>
+      </w:hyperlink>
+    </w:p>
+    <w:p>
+      <w:r>
+        <w:rPr/>
+        <w:t xml:space="preserve">[6] WebAssembly threads Atomic access, wait/notify distinctions, shared-memory initialization and the host-facing synchronization basis. </w:t>
+      </w:r>
+      <w:hyperlink r:id="rId16">
+        <w:r>
+          <w:rPr>
+            <w:color w:val="175C91"/>
+            <w:u w:val="single"/>
+          </w:rPr>
+          <w:t xml:space="preserve">Threads overview</w:t>
+        </w:r>
+      </w:hyperlink>
+    </w:p>
+    <w:p>
+      <w:r>
+        <w:rPr/>
+        <w:t xml:space="preserve">[7] WebAssembly tail calls and multiple results Tail transfers use the callee signature and compatible result types; linear-memory Lisp-stack ownership remains an implementation contract. </w:t>
+      </w:r>
+      <w:hyperlink r:id="rId17">
+        <w:r>
+          <w:rPr>
+            <w:color w:val="175C91"/>
+            <w:u w:val="single"/>
+          </w:rPr>
+          <w:t xml:space="preserve">Tail-call overview</w:t>
+        </w:r>
+      </w:hyperlink>
+      <w:r>
+        <w:rPr/>
+        <w:t xml:space="preserve"> · </w:t>
+      </w:r>
       <w:hyperlink r:id="rId14">
         <w:r>
           <w:rPr>
             <w:color w:val="175C91"/>
             <w:u w:val="single"/>
           </w:rPr>
-          <w:t xml:space="preserve">Threads: limits and memory types</w:t>
-        </w:r>
-      </w:hyperlink>
-    </w:p>
-    <w:p>
-      <w:r>
-        <w:rPr/>
-        <w:t xml:space="preserve">[6] WebAssembly threads Atomic access, wait/notify distinctions, shared-memory initialization and the host-facing synchronization basis. </w:t>
-      </w:r>
-      <w:hyperlink r:id="rId15">
-        <w:r>
-          <w:rPr>
-            <w:color w:val="175C91"/>
-            <w:u w:val="single"/>
-          </w:rPr>
-          <w:t xml:space="preserve">Threads overview</w:t>
-        </w:r>
-      </w:hyperlink>
-    </w:p>
-    <w:p>
-      <w:r>
-        <w:rPr/>
-        <w:t xml:space="preserve">[7] WebAssembly tail calls and multiple results Tail transfers use the callee signature and compatible result types; linear-memory Lisp-stack ownership remains an implementation contract. </w:t>
-      </w:r>
-      <w:hyperlink r:id="rId16">
-        <w:r>
-          <w:rPr>
-            <w:color w:val="175C91"/>
-            <w:u w:val="single"/>
-          </w:rPr>
-          <w:t xml:space="preserve">Tail-call overview</w:t>
+          <w:t xml:space="preserve">Core validation</w:t>
+        </w:r>
+      </w:hyperlink>
+    </w:p>
+    <w:p>
+      <w:r>
+        <w:rPr/>
+        <w:t xml:space="preserve">[8] CCL backend and native pass 2 Native argument-register conventions are comparison evidence, not a Wasm parameter limit. </w:t>
+      </w:r>
+      <w:hyperlink r:id="rId18">
+        <w:r>
+          <w:rPr>
+            <w:color w:val="175C91"/>
+            <w:u w:val="single"/>
+          </w:rPr>
+          <w:t xml:space="preserve">backend.lisp</w:t>
         </w:r>
       </w:hyperlink>
       <w:r>
         <w:rPr/>
         <w:t xml:space="preserve"> · </w:t>
       </w:r>
-      <w:hyperlink r:id="rId13">
-        <w:r>
-          <w:rPr>
-            <w:color w:val="175C91"/>
-            <w:u w:val="single"/>
-          </w:rPr>
-          <w:t xml:space="preserve">Core validation</w:t>
-        </w:r>
-      </w:hyperlink>
-    </w:p>
-    <w:p>
-      <w:r>
-        <w:rPr/>
-        <w:t xml:space="preserve">[8] CCL backend and native pass 2 Native argument-register conventions are comparison evidence, not a Wasm parameter limit. </w:t>
-      </w:r>
-      <w:hyperlink r:id="rId17">
-        <w:r>
-          <w:rPr>
-            <w:color w:val="175C91"/>
-            <w:u w:val="single"/>
-          </w:rPr>
-          <w:t xml:space="preserve">backend.lisp</w:t>
+      <w:hyperlink r:id="rId19">
+        <w:r>
+          <w:rPr>
+            <w:color w:val="175C91"/>
+            <w:u w:val="single"/>
+          </w:rPr>
+          <w:t xml:space="preserve">x862.lisp</w:t>
+        </w:r>
+      </w:hyperlink>
+    </w:p>
+    <w:p>
+      <w:r>
+        <w:rPr/>
+        <w:t xml:space="preserve">[9] LLVM WebAssembly linker Import/export and memory/table options; signature-mismatch warnings and trapping stubs; strict link policy. </w:t>
+      </w:r>
+      <w:hyperlink r:id="rId20">
+        <w:r>
+          <w:rPr>
+            <w:color w:val="175C91"/>
+            <w:u w:val="single"/>
+          </w:rPr>
+          <w:t xml:space="preserve">LLD WebAssembly documentation</w:t>
+        </w:r>
+      </w:hyperlink>
+    </w:p>
+    <w:p>
+      <w:pPr>
+        <w:pStyle w:val="Heading1"/>
+      </w:pPr>
+      <w:r>
+        <w:rPr/>
+        <w:t xml:space="preserve">REFERENCES  /  CONTINUED</w:t>
+      </w:r>
+    </w:p>
+    <w:p>
+      <w:pPr>
+        <w:pStyle w:val="Heading2"/>
+      </w:pPr>
+      <w:r>
+        <w:rPr/>
+        <w:t xml:space="preserve">Kernel, ABI and project-document sources</w:t>
+      </w:r>
+    </w:p>
+    <w:p>
+      <w:r>
+        <w:rPr/>
+        <w:t xml:space="preserve">[10] Kernel adaptation and exact imports Portable and architecture-specific collector work must be audited together; imports.s is the exact census source. </w:t>
+      </w:r>
+      <w:hyperlink r:id="rId21">
+        <w:r>
+          <w:rPr>
+            <w:color w:val="175C91"/>
+            <w:u w:val="single"/>
+          </w:rPr>
+          <w:t xml:space="preserve">gc-common.c</w:t>
         </w:r>
       </w:hyperlink>
       <w:r>
         <w:rPr/>
         <w:t xml:space="preserve"> · </w:t>
       </w:r>
-      <w:hyperlink r:id="rId18">
-        <w:r>
-          <w:rPr>
-            <w:color w:val="175C91"/>
-            <w:u w:val="single"/>
-          </w:rPr>
-          <w:t xml:space="preserve">x862.lisp</w:t>
-        </w:r>
-      </w:hyperlink>
-    </w:p>
-    <w:p>
-      <w:r>
-        <w:rPr/>
-        <w:t xml:space="preserve">[9] LLVM WebAssembly linker Import/export and memory/table options; signature-mismatch warnings and trapping stubs; strict link policy. </w:t>
-      </w:r>
-      <w:hyperlink r:id="rId19">
-        <w:r>
-          <w:rPr>
-            <w:color w:val="175C91"/>
-            <w:u w:val="single"/>
-          </w:rPr>
-          <w:t xml:space="preserve">LLD WebAssembly documentation</w:t>
-        </w:r>
-      </w:hyperlink>
-    </w:p>
-    <w:p>
-      <w:pPr>
-        <w:pStyle w:val="Heading1"/>
-      </w:pPr>
-      <w:r>
-        <w:rPr/>
-        <w:t xml:space="preserve">REFERENCES  /  CONTINUED</w:t>
-      </w:r>
-    </w:p>
-    <w:p>
-      <w:pPr>
-        <w:pStyle w:val="Heading2"/>
-      </w:pPr>
-      <w:r>
-        <w:rPr/>
-        <w:t xml:space="preserve">Kernel, ABI and project-document sources</w:t>
-      </w:r>
-    </w:p>
-    <w:p>
-      <w:r>
-        <w:rPr/>
-        <w:t xml:space="preserve">[10] Kernel adaptation and exact imports Portable and architecture-specific collector work must be audited together; imports.s is the exact census source. </w:t>
-      </w:r>
-      <w:hyperlink r:id="rId20">
-        <w:r>
-          <w:rPr>
-            <w:color w:val="175C91"/>
-            <w:u w:val="single"/>
-          </w:rPr>
-          <w:t xml:space="preserve">gc-common.c</w:t>
+      <w:hyperlink r:id="rId22">
+        <w:r>
+          <w:rPr>
+            <w:color w:val="175C91"/>
+            <w:u w:val="single"/>
+          </w:rPr>
+          <w:t xml:space="preserve">x86-gc.c</w:t>
         </w:r>
       </w:hyperlink>
       <w:r>
         <w:rPr/>
         <w:t xml:space="preserve"> · </w:t>
       </w:r>
-      <w:hyperlink r:id="rId21">
-        <w:r>
-          <w:rPr>
-            <w:color w:val="175C91"/>
-            <w:u w:val="single"/>
-          </w:rPr>
-          <w:t xml:space="preserve">x86-gc.c</w:t>
+      <w:hyperlink r:id="rId23">
+        <w:r>
+          <w:rPr>
+            <w:color w:val="175C91"/>
+            <w:u w:val="single"/>
+          </w:rPr>
+          <w:t xml:space="preserve">image.c</w:t>
         </w:r>
       </w:hyperlink>
       <w:r>
         <w:rPr/>
         <w:t xml:space="preserve"> · </w:t>
       </w:r>
-      <w:hyperlink r:id="rId22">
-        <w:r>
-          <w:rPr>
-            <w:color w:val="175C91"/>
-            <w:u w:val="single"/>
-          </w:rPr>
-          <w:t xml:space="preserve">image.c</w:t>
+      <w:hyperlink r:id="rId24">
+        <w:r>
+          <w:rPr>
+            <w:color w:val="175C91"/>
+            <w:u w:val="single"/>
+          </w:rPr>
+          <w:t xml:space="preserve">memory.c</w:t>
         </w:r>
       </w:hyperlink>
       <w:r>
         <w:rPr/>
         <w:t xml:space="preserve"> · </w:t>
       </w:r>
-      <w:hyperlink r:id="rId23">
-        <w:r>
-          <w:rPr>
-            <w:color w:val="175C91"/>
-            <w:u w:val="single"/>
-          </w:rPr>
-          <w:t xml:space="preserve">memory.c</w:t>
+      <w:hyperlink r:id="rId25">
+        <w:r>
+          <w:rPr>
+            <w:color w:val="175C91"/>
+            <w:u w:val="single"/>
+          </w:rPr>
+          <w:t xml:space="preserve">thread_manager.c</w:t>
         </w:r>
       </w:hyperlink>
       <w:r>
         <w:rPr/>
         <w:t xml:space="preserve"> · </w:t>
       </w:r>
-      <w:hyperlink r:id="rId24">
-        <w:r>
-          <w:rPr>
-            <w:color w:val="175C91"/>
-            <w:u w:val="single"/>
-          </w:rPr>
-          <w:t xml:space="preserve">thread_manager.c</w:t>
+      <w:hyperlink r:id="rId26">
+        <w:r>
+          <w:rPr>
+            <w:color w:val="175C91"/>
+            <w:u w:val="single"/>
+          </w:rPr>
+          <w:t xml:space="preserve">imports.s</w:t>
+        </w:r>
+      </w:hyperlink>
+    </w:p>
+    <w:p>
+      <w:r>
+        <w:rPr/>
+        <w:t xml:space="preserve">[11] Native trap/check lowering inventory Previously recorded x86-64 UUO/check occurrences remain a worklist to reconcile with evaluated census records. </w:t>
+      </w:r>
+      <w:hyperlink r:id="rId27">
+        <w:r>
+          <w:rPr>
+            <w:color w:val="175C91"/>
+            <w:u w:val="single"/>
+          </w:rPr>
+          <w:t xml:space="preserve">x8664-vinsns.lisp</w:t>
+        </w:r>
+      </w:hyperlink>
+    </w:p>
+    <w:p>
+      <w:r>
+        <w:rPr/>
+        <w:t xml:space="preserve">[12] WebAssembly heterogeneous function tables and call-site types Core control instructions and call_indirect / return_call_indirect validation. A static expected type belongs to the call site; incompatible table entries trap before entry. </w:t>
+      </w:r>
+      <w:hyperlink r:id="rId28">
+        <w:r>
+          <w:rPr>
+            <w:color w:val="175C91"/>
+            <w:u w:val="single"/>
+          </w:rPr>
+          <w:t xml:space="preserve">Core: control instructions</w:t>
         </w:r>
       </w:hyperlink>
       <w:r>
         <w:rPr/>
         <w:t xml:space="preserve"> · </w:t>
       </w:r>
-      <w:hyperlink r:id="rId25">
-        <w:r>
-          <w:rPr>
-            <w:color w:val="175C91"/>
-            <w:u w:val="single"/>
-          </w:rPr>
-          <w:t xml:space="preserve">imports.s</w:t>
-        </w:r>
-      </w:hyperlink>
-    </w:p>
-    <w:p>
-      <w:r>
-        <w:rPr/>
-        <w:t xml:space="preserve">[11] Native trap/check lowering inventory Previously recorded x86-64 UUO/check occurrences remain a worklist to reconcile with evaluated census records. </w:t>
-      </w:r>
-      <w:hyperlink r:id="rId26">
-        <w:r>
-          <w:rPr>
-            <w:color w:val="175C91"/>
-            <w:u w:val="single"/>
-          </w:rPr>
-          <w:t xml:space="preserve">x8664-vinsns.lisp</w:t>
-        </w:r>
-      </w:hyperlink>
-    </w:p>
-    <w:p>
-      <w:r>
-        <w:rPr/>
-        <w:t xml:space="preserve">[12] WebAssembly heterogeneous function tables and call-site types Core control instructions and call_indirect / return_call_indirect validation. A static expected type belongs to the call site; incompatible table entries trap before entry. </w:t>
-      </w:r>
-      <w:hyperlink r:id="rId27">
-        <w:r>
-          <w:rPr>
-            <w:color w:val="175C91"/>
-            <w:u w:val="single"/>
-          </w:rPr>
-          <w:t xml:space="preserve">Core: control instructions</w:t>
+      <w:hyperlink r:id="rId14">
+        <w:r>
+          <w:rPr>
+            <w:color w:val="175C91"/>
+            <w:u w:val="single"/>
+          </w:rPr>
+          <w:t xml:space="preserve">Core: validation and execution</w:t>
+        </w:r>
+      </w:hyperlink>
+    </w:p>
+    <w:p>
+      <w:r>
+        <w:rPr/>
+        <w:t xml:space="preserve">[13] WebAssembly Basic C ABI Scalar versus aggregate parameter/result passing; address-taken locals and the linear C stack. </w:t>
+      </w:r>
+      <w:hyperlink r:id="rId29">
+        <w:r>
+          <w:rPr>
+            <w:color w:val="175C91"/>
+            <w:u w:val="single"/>
+          </w:rPr>
+          <w:t xml:space="preserve">BasicCABI.md</w:t>
+        </w:r>
+      </w:hyperlink>
+    </w:p>
+    <w:p>
+      <w:r>
+        <w:rPr/>
+        <w:t xml:space="preserve">[14] WebAssembly linking conventions Process-once initialization with passive segments and per-thread storage conventions; verify the actual linked output. </w:t>
+      </w:r>
+      <w:hyperlink r:id="rId30">
+        <w:r>
+          <w:rPr>
+            <w:color w:val="175C91"/>
+            <w:u w:val="single"/>
+          </w:rPr>
+          <w:t xml:space="preserve">Linking.md</w:t>
+        </w:r>
+      </w:hyperlink>
+    </w:p>
+    <w:p>
+      <w:r>
+        <w:rPr/>
+        <w:t xml:space="preserve">[15] Common Lisp ordinary lambda lists and calls Required, optional, rest and keyword arguments; FUNCALL/APPLY semantics. A supplied count does not determine callee convention. </w:t>
+      </w:r>
+      <w:hyperlink r:id="rId31">
+        <w:r>
+          <w:rPr>
+            <w:color w:val="175C91"/>
+            <w:u w:val="single"/>
+          </w:rPr>
+          <w:t xml:space="preserve">Lambda lists</w:t>
         </w:r>
       </w:hyperlink>
       <w:r>
         <w:rPr/>
         <w:t xml:space="preserve"> · </w:t>
       </w:r>
-      <w:hyperlink r:id="rId13">
-        <w:r>
-          <w:rPr>
-            <w:color w:val="175C91"/>
-            <w:u w:val="single"/>
-          </w:rPr>
-          <w:t xml:space="preserve">Core: validation and execution</w:t>
-        </w:r>
-      </w:hyperlink>
-    </w:p>
-    <w:p>
-      <w:r>
-        <w:rPr/>
-        <w:t xml:space="preserve">[13] WebAssembly Basic C ABI Scalar versus aggregate parameter/result passing; address-taken locals and the linear C stack. </w:t>
-      </w:r>
-      <w:hyperlink r:id="rId28">
-        <w:r>
-          <w:rPr>
-            <w:color w:val="175C91"/>
-            <w:u w:val="single"/>
-          </w:rPr>
-          <w:t xml:space="preserve">BasicCABI.md</w:t>
-        </w:r>
-      </w:hyperlink>
-    </w:p>
-    <w:p>
-      <w:r>
-        <w:rPr/>
-        <w:t xml:space="preserve">[14] WebAssembly linking conventions Process-once initialization with passive segments and per-thread storage conventions; verify the actual linked output. </w:t>
-      </w:r>
-      <w:hyperlink r:id="rId29">
-        <w:r>
-          <w:rPr>
-            <w:color w:val="175C91"/>
-            <w:u w:val="single"/>
-          </w:rPr>
-          <w:t xml:space="preserve">Linking.md</w:t>
-        </w:r>
-      </w:hyperlink>
-    </w:p>
-    <w:p>
-      <w:r>
-        <w:rPr/>
-        <w:t xml:space="preserve">[15] Common Lisp ordinary lambda lists and calls Required, optional, rest and keyword arguments; FUNCALL/APPLY semantics. A supplied count does not determine callee convention. </w:t>
-      </w:r>
-      <w:hyperlink r:id="rId30">
-        <w:r>
-          <w:rPr>
-            <w:color w:val="175C91"/>
-            <w:u w:val="single"/>
-          </w:rPr>
-          <w:t xml:space="preserve">Lambda lists</w:t>
+      <w:hyperlink r:id="rId32">
+        <w:r>
+          <w:rPr>
+            <w:color w:val="175C91"/>
+            <w:u w:val="single"/>
+          </w:rPr>
+          <w:t xml:space="preserve">FUNCALL</w:t>
         </w:r>
       </w:hyperlink>
       <w:r>
         <w:rPr/>
         <w:t xml:space="preserve"> · </w:t>
       </w:r>
-      <w:hyperlink r:id="rId31">
-        <w:r>
-          <w:rPr>
-            <w:color w:val="175C91"/>
-            <w:u w:val="single"/>
-          </w:rPr>
-          <w:t xml:space="preserve">FUNCALL</w:t>
-        </w:r>
-      </w:hyperlink>
-      <w:r>
-        <w:rPr/>
-        <w:t xml:space="preserve"> · </w:t>
-      </w:r>
-      <w:hyperlink r:id="rId32">
+      <w:hyperlink r:id="rId33">
         <w:r>
           <w:rPr>
             <w:color w:val="175C91"/>
@@ -3055,7 +3068,7 @@
         <w:rPr/>
         <w:t xml:space="preserve">[16] WebAssembly numeric semantics Floating-point operation and operand cases; result classification alone is not a CCL condition policy. </w:t>
       </w:r>
-      <w:hyperlink r:id="rId33">
+      <w:hyperlink r:id="rId34">
         <w:r>
           <w:rPr>
             <w:color w:val="175C91"/>

</xml_diff>